<commit_message>
fix(report): render md's line-1 title on the cover page
Capture the md's single level-1 heading (BÁO CÁO BÀI TẬP LỚN – CS112)
verbatim and render it as a prominent title above the existing cover
block, instead of silently discarding it. Not Heading-styled, so it
stays out of the TOC.
</commit_message>
<xml_diff>
--- a/report/bao-cao.docx
+++ b/report/bao-cao.docx
@@ -10,6 +10,22 @@
       </w:pPr>
       <w:r>
         <w:rPr/>
+      </w:r>
+    </w:p>
+    <w:p>
+      <w:pPr>
+        <w:pStyle w:val="Normal"/>
+        <w:spacing w:before="0" w:after="360"/>
+        <w:jc w:val="center"/>
+        <w:rPr/>
+      </w:pPr>
+      <w:r>
+        <w:rPr>
+          <w:b/>
+          <w:i w:val="false"/>
+          <w:sz w:val="44"/>
+        </w:rPr>
+        <w:t>BÁO CÁO BÀI TẬP LỚN – CS112</w:t>
       </w:r>
     </w:p>
     <w:p>
@@ -232,7 +248,7 @@
             </w:rPr>
             <w:fldChar w:fldCharType="separate"/>
           </w:r>
-          <w:hyperlink w:anchor="__RefHeading___Toc3739_3676404199" w:tooltip="Chương 1. Giới thiệu bài toán">
+          <w:hyperlink w:anchor="__RefHeading___Toc3740_4014962403" w:tooltip="Chương 1. Giới thiệu bài toán">
             <w:r>
               <w:rPr>
                 <w:rStyle w:val="IndexLink"/>
@@ -259,7 +275,7 @@
             </w:tabs>
             <w:rPr/>
           </w:pPr>
-          <w:hyperlink w:anchor="__RefHeading___Toc3741_3676404199" w:tooltip="1.1. Lý do chọn bài toán">
+          <w:hyperlink w:anchor="__RefHeading___Toc3742_4014962403" w:tooltip="1.1. Lý do chọn bài toán">
             <w:r>
               <w:rPr>
                 <w:rStyle w:val="IndexLink"/>
@@ -286,7 +302,7 @@
             </w:tabs>
             <w:rPr/>
           </w:pPr>
-          <w:hyperlink w:anchor="__RefHeading___Toc3743_3676404199" w:tooltip="1.2. Nguồn gốc">
+          <w:hyperlink w:anchor="__RefHeading___Toc3744_4014962403" w:tooltip="1.2. Nguồn gốc">
             <w:r>
               <w:rPr>
                 <w:rStyle w:val="IndexLink"/>
@@ -313,7 +329,7 @@
             </w:tabs>
             <w:rPr/>
           </w:pPr>
-          <w:hyperlink w:anchor="__RefHeading___Toc3745_3676404199" w:tooltip="1.3. Ứng dụng thực tế">
+          <w:hyperlink w:anchor="__RefHeading___Toc3746_4014962403" w:tooltip="1.3. Ứng dụng thực tế">
             <w:r>
               <w:rPr>
                 <w:rStyle w:val="IndexLink"/>
@@ -340,7 +356,7 @@
             </w:tabs>
             <w:rPr/>
           </w:pPr>
-          <w:hyperlink w:anchor="__RefHeading___Toc3747_3676404199" w:tooltip="Chương 2. Mô tả và mô hình bài toán">
+          <w:hyperlink w:anchor="__RefHeading___Toc3748_4014962403" w:tooltip="Chương 2. Mô tả và mô hình bài toán">
             <w:r>
               <w:rPr>
                 <w:rStyle w:val="IndexLink"/>
@@ -367,7 +383,7 @@
             </w:tabs>
             <w:rPr/>
           </w:pPr>
-          <w:hyperlink w:anchor="__RefHeading___Toc3749_3676404199" w:tooltip="2.1. Phát biểu theo kiểu đề thi">
+          <w:hyperlink w:anchor="__RefHeading___Toc3750_4014962403" w:tooltip="2.1. Phát biểu theo kiểu đề thi">
             <w:r>
               <w:rPr>
                 <w:rStyle w:val="IndexLink"/>
@@ -394,7 +410,7 @@
             </w:tabs>
             <w:rPr/>
           </w:pPr>
-          <w:hyperlink w:anchor="__RefHeading___Toc3751_3676404199" w:tooltip="2.2. Mô hình hóa">
+          <w:hyperlink w:anchor="__RefHeading___Toc3752_4014962403" w:tooltip="2.2. Mô hình hóa">
             <w:r>
               <w:rPr>
                 <w:rStyle w:val="IndexLink"/>
@@ -421,7 +437,7 @@
             </w:tabs>
             <w:rPr/>
           </w:pPr>
-          <w:hyperlink w:anchor="__RefHeading___Toc3753_3676404199" w:tooltip="2.3. Input">
+          <w:hyperlink w:anchor="__RefHeading___Toc3754_4014962403" w:tooltip="2.3. Input">
             <w:r>
               <w:rPr>
                 <w:rStyle w:val="IndexLink"/>
@@ -448,7 +464,7 @@
             </w:tabs>
             <w:rPr/>
           </w:pPr>
-          <w:hyperlink w:anchor="__RefHeading___Toc3755_3676404199" w:tooltip="2.4. Output">
+          <w:hyperlink w:anchor="__RefHeading___Toc3756_4014962403" w:tooltip="2.4. Output">
             <w:r>
               <w:rPr>
                 <w:rStyle w:val="IndexLink"/>
@@ -475,7 +491,7 @@
             </w:tabs>
             <w:rPr/>
           </w:pPr>
-          <w:hyperlink w:anchor="__RefHeading___Toc3757_3676404199" w:tooltip="2.5. Ràng buộc">
+          <w:hyperlink w:anchor="__RefHeading___Toc3758_4014962403" w:tooltip="2.5. Ràng buộc">
             <w:r>
               <w:rPr>
                 <w:rStyle w:val="IndexLink"/>
@@ -502,7 +518,7 @@
             </w:tabs>
             <w:rPr/>
           </w:pPr>
-          <w:hyperlink w:anchor="__RefHeading___Toc3759_3676404199" w:tooltip="2.6. Ví dụ Input/Output">
+          <w:hyperlink w:anchor="__RefHeading___Toc3760_4014962403" w:tooltip="2.6. Ví dụ Input/Output">
             <w:r>
               <w:rPr>
                 <w:rStyle w:val="IndexLink"/>
@@ -529,7 +545,7 @@
             </w:tabs>
             <w:rPr/>
           </w:pPr>
-          <w:hyperlink w:anchor="__RefHeading___Toc3761_3676404199" w:tooltip="Chương 3. Thiết kế cấu trúc dữ liệu và thuật toán">
+          <w:hyperlink w:anchor="__RefHeading___Toc3762_4014962403" w:tooltip="Chương 3. Thiết kế cấu trúc dữ liệu và thuật toán">
             <w:r>
               <w:rPr>
                 <w:rStyle w:val="IndexLink"/>
@@ -556,7 +572,7 @@
             </w:tabs>
             <w:rPr/>
           </w:pPr>
-          <w:hyperlink w:anchor="__RefHeading___Toc3763_3676404199" w:tooltip="3.1. Cấu trúc dữ liệu">
+          <w:hyperlink w:anchor="__RefHeading___Toc3764_4014962403" w:tooltip="3.1. Cấu trúc dữ liệu">
             <w:r>
               <w:rPr>
                 <w:rStyle w:val="IndexLink"/>
@@ -583,7 +599,7 @@
             </w:tabs>
             <w:rPr/>
           </w:pPr>
-          <w:hyperlink w:anchor="__RefHeading___Toc3765_3676404199" w:tooltip="3.2. Phân tích đặc trưng (ý tưởng giải)">
+          <w:hyperlink w:anchor="__RefHeading___Toc3766_4014962403" w:tooltip="3.2. Phân tích đặc trưng (ý tưởng giải)">
             <w:r>
               <w:rPr>
                 <w:rStyle w:val="IndexLink"/>
@@ -610,7 +626,7 @@
             </w:tabs>
             <w:rPr/>
           </w:pPr>
-          <w:hyperlink w:anchor="__RefHeading___Toc3767_3676404199" w:tooltip="3.3. Năm thuật toán">
+          <w:hyperlink w:anchor="__RefHeading___Toc3768_4014962403" w:tooltip="3.3. Năm thuật toán">
             <w:r>
               <w:rPr>
                 <w:rStyle w:val="IndexLink"/>
@@ -637,7 +653,7 @@
             </w:tabs>
             <w:rPr/>
           </w:pPr>
-          <w:hyperlink w:anchor="__RefHeading___Toc3769_3676404199" w:tooltip="(1) Tham lam theo thứ tự đỉnh (Greedy)">
+          <w:hyperlink w:anchor="__RefHeading___Toc3770_4014962403" w:tooltip="(1) Tham lam theo thứ tự đỉnh (Greedy)">
             <w:r>
               <w:rPr>
                 <w:rStyle w:val="IndexLink"/>
@@ -664,7 +680,7 @@
             </w:tabs>
             <w:rPr/>
           </w:pPr>
-          <w:hyperlink w:anchor="__RefHeading___Toc3771_3676404199" w:tooltip="(2) Welsh–Powell">
+          <w:hyperlink w:anchor="__RefHeading___Toc3772_4014962403" w:tooltip="(2) Welsh–Powell">
             <w:r>
               <w:rPr>
                 <w:rStyle w:val="IndexLink"/>
@@ -691,7 +707,7 @@
             </w:tabs>
             <w:rPr/>
           </w:pPr>
-          <w:hyperlink w:anchor="__RefHeading___Toc3773_3676404199" w:tooltip="(3) DSATUR (Brélaz, 1979) – mở rộng ngoài sách, app ghi rõ">
+          <w:hyperlink w:anchor="__RefHeading___Toc3774_4014962403" w:tooltip="(3) DSATUR (Brélaz, 1979) – mở rộng ngoài sách, app ghi rõ">
             <w:r>
               <w:rPr>
                 <w:rStyle w:val="IndexLink"/>
@@ -718,7 +734,7 @@
             </w:tabs>
             <w:rPr/>
           </w:pPr>
-          <w:hyperlink w:anchor="__RefHeading___Toc3775_3676404199" w:tooltip="(4) Quay lui (Levitin §12.1)">
+          <w:hyperlink w:anchor="__RefHeading___Toc3776_4014962403" w:tooltip="(4) Quay lui (Levitin §12.1)">
             <w:r>
               <w:rPr>
                 <w:rStyle w:val="IndexLink"/>
@@ -745,7 +761,7 @@
             </w:tabs>
             <w:rPr/>
           </w:pPr>
-          <w:hyperlink w:anchor="__RefHeading___Toc3777_3676404199" w:tooltip="(5) Vét cạn">
+          <w:hyperlink w:anchor="__RefHeading___Toc3778_4014962403" w:tooltip="(5) Vét cạn">
             <w:r>
               <w:rPr>
                 <w:rStyle w:val="IndexLink"/>
@@ -772,7 +788,7 @@
             </w:tabs>
             <w:rPr/>
           </w:pPr>
-          <w:hyperlink w:anchor="__RefHeading___Toc3779_3676404199" w:tooltip="Bảng tổng hợp">
+          <w:hyperlink w:anchor="__RefHeading___Toc3780_4014962403" w:tooltip="Bảng tổng hợp">
             <w:r>
               <w:rPr>
                 <w:rStyle w:val="IndexLink"/>
@@ -799,7 +815,7 @@
             </w:tabs>
             <w:rPr/>
           </w:pPr>
-          <w:hyperlink w:anchor="__RefHeading___Toc3781_3676404199" w:tooltip="Chế độ tìm sắc số χ(G)">
+          <w:hyperlink w:anchor="__RefHeading___Toc3782_4014962403" w:tooltip="Chế độ tìm sắc số χ(G)">
             <w:r>
               <w:rPr>
                 <w:rStyle w:val="IndexLink"/>
@@ -826,7 +842,7 @@
             </w:tabs>
             <w:rPr/>
           </w:pPr>
-          <w:hyperlink w:anchor="__RefHeading___Toc3783_3676404199" w:tooltip="Chương 4. Ví dụ minh họa các bước thực hiện">
+          <w:hyperlink w:anchor="__RefHeading___Toc3784_4014962403" w:tooltip="Chương 4. Ví dụ minh họa các bước thực hiện">
             <w:r>
               <w:rPr>
                 <w:rStyle w:val="IndexLink"/>
@@ -853,7 +869,7 @@
             </w:tabs>
             <w:rPr/>
           </w:pPr>
-          <w:hyperlink w:anchor="__RefHeading___Toc3785_3676404199" w:tooltip="4.1. Ví dụ chung">
+          <w:hyperlink w:anchor="__RefHeading___Toc3786_4014962403" w:tooltip="4.1. Ví dụ chung">
             <w:r>
               <w:rPr>
                 <w:rStyle w:val="IndexLink"/>
@@ -880,7 +896,7 @@
             </w:tabs>
             <w:rPr/>
           </w:pPr>
-          <w:hyperlink w:anchor="__RefHeading___Toc3787_3676404199" w:tooltip="4.2. Quay lui trên ví dụ chung (khớp đúng trace của Player)">
+          <w:hyperlink w:anchor="__RefHeading___Toc3788_4014962403" w:tooltip="4.2. Quay lui trên ví dụ chung (khớp đúng trace của Player)">
             <w:r>
               <w:rPr>
                 <w:rStyle w:val="IndexLink"/>
@@ -907,7 +923,7 @@
             </w:tabs>
             <w:rPr/>
           </w:pPr>
-          <w:hyperlink w:anchor="__RefHeading___Toc3789_3676404199" w:tooltip="4.3. Cùng ví dụ, bốn thuật toán còn lại (trace thật)">
+          <w:hyperlink w:anchor="__RefHeading___Toc3790_4014962403" w:tooltip="4.3. Cùng ví dụ, bốn thuật toán còn lại (trace thật)">
             <w:r>
               <w:rPr>
                 <w:rStyle w:val="IndexLink"/>
@@ -934,7 +950,7 @@
             </w:tabs>
             <w:rPr/>
           </w:pPr>
-          <w:hyperlink w:anchor="__RefHeading___Toc3791_3676404199" w:tooltip="Chương 5. Tường thuật quá trình thiết kế và xây dựng">
+          <w:hyperlink w:anchor="__RefHeading___Toc3792_4014962403" w:tooltip="Chương 5. Tường thuật quá trình thiết kế và xây dựng">
             <w:r>
               <w:rPr>
                 <w:rStyle w:val="IndexLink"/>
@@ -961,7 +977,7 @@
             </w:tabs>
             <w:rPr/>
           </w:pPr>
-          <w:hyperlink w:anchor="__RefHeading___Toc3793_3676404199" w:tooltip="5.1. Nói rõ ngay từ đầu">
+          <w:hyperlink w:anchor="__RefHeading___Toc3794_4014962403" w:tooltip="5.1. Nói rõ ngay từ đầu">
             <w:r>
               <w:rPr>
                 <w:rStyle w:val="IndexLink"/>
@@ -988,7 +1004,7 @@
             </w:tabs>
             <w:rPr/>
           </w:pPr>
-          <w:hyperlink w:anchor="__RefHeading___Toc3795_3676404199" w:tooltip="5.2. Công cụ sử dụng">
+          <w:hyperlink w:anchor="__RefHeading___Toc3796_4014962403" w:tooltip="5.2. Công cụ sử dụng">
             <w:r>
               <w:rPr>
                 <w:rStyle w:val="IndexLink"/>
@@ -1015,7 +1031,7 @@
             </w:tabs>
             <w:rPr/>
           </w:pPr>
-          <w:hyperlink w:anchor="__RefHeading___Toc3797_3676404199" w:tooltip="5.3. Dòng thời gian">
+          <w:hyperlink w:anchor="__RefHeading___Toc3798_4014962403" w:tooltip="5.3. Dòng thời gian">
             <w:r>
               <w:rPr>
                 <w:rStyle w:val="IndexLink"/>
@@ -1042,7 +1058,7 @@
             </w:tabs>
             <w:rPr/>
           </w:pPr>
-          <w:hyperlink w:anchor="__RefHeading___Toc3799_3676404199" w:tooltip="5.4. Thiết kế chức năng và giao diện">
+          <w:hyperlink w:anchor="__RefHeading___Toc3800_4014962403" w:tooltip="5.4. Thiết kế chức năng và giao diện">
             <w:r>
               <w:rPr>
                 <w:rStyle w:val="IndexLink"/>
@@ -1069,7 +1085,7 @@
             </w:tabs>
             <w:rPr/>
           </w:pPr>
-          <w:hyperlink w:anchor="__RefHeading___Toc3801_3676404199" w:tooltip="5.5. Các sự cố tiêu biểu và cách xử lý">
+          <w:hyperlink w:anchor="__RefHeading___Toc3802_4014962403" w:tooltip="5.5. Các sự cố tiêu biểu và cách xử lý">
             <w:r>
               <w:rPr>
                 <w:rStyle w:val="IndexLink"/>
@@ -1096,7 +1112,7 @@
             </w:tabs>
             <w:rPr/>
           </w:pPr>
-          <w:hyperlink w:anchor="__RefHeading___Toc3803_3676404199" w:tooltip="Sự cố 1 – Bài tô màu đồ thị bị review FAIL với 4 lỗi (PR #7)">
+          <w:hyperlink w:anchor="__RefHeading___Toc3804_4014962403" w:tooltip="Sự cố 1 – Bài tô màu đồ thị bị review FAIL với 4 lỗi (PR #7)">
             <w:r>
               <w:rPr>
                 <w:rStyle w:val="IndexLink"/>
@@ -1123,7 +1139,7 @@
             </w:tabs>
             <w:rPr/>
           </w:pPr>
-          <w:hyperlink w:anchor="__RefHeading___Toc3805_3676404199" w:tooltip="Sự cố 2 – Nhánh cận đánh dấu sai nút tốt nhất (PR #1, bài cái túi)">
+          <w:hyperlink w:anchor="__RefHeading___Toc3806_4014962403" w:tooltip="Sự cố 2 – Nhánh cận đánh dấu sai nút tốt nhất (PR #1, bài cái túi)">
             <w:r>
               <w:rPr>
                 <w:rStyle w:val="IndexLink"/>
@@ -1150,7 +1166,7 @@
             </w:tabs>
             <w:rPr/>
           </w:pPr>
-          <w:hyperlink w:anchor="__RefHeading___Toc3807_3676404199" w:tooltip="Sự cố 3 – Lời giải tham chiếu tự tham chiếu lặp lại ở nhiều nhóm">
+          <w:hyperlink w:anchor="__RefHeading___Toc3808_4014962403" w:tooltip="Sự cố 3 – Lời giải tham chiếu tự tham chiếu lặp lại ở nhiều nhóm">
             <w:r>
               <w:rPr>
                 <w:rStyle w:val="IndexLink"/>
@@ -1177,7 +1193,7 @@
             </w:tabs>
             <w:rPr/>
           </w:pPr>
-          <w:hyperlink w:anchor="__RefHeading___Toc3809_3676404199" w:tooltip="Sự cố 4 – Code viết dồn một dòng (PR #3, #4)">
+          <w:hyperlink w:anchor="__RefHeading___Toc3810_4014962403" w:tooltip="Sự cố 4 – Code viết dồn một dòng (PR #3, #4)">
             <w:r>
               <w:rPr>
                 <w:rStyle w:val="IndexLink"/>
@@ -1204,7 +1220,7 @@
             </w:tabs>
             <w:rPr/>
           </w:pPr>
-          <w:hyperlink w:anchor="__RefHeading___Toc3811_3676404199" w:tooltip="(Tuỳ chọn) Sự cố 5 – Trang So sánh cần 6 vòng review (PR #8)">
+          <w:hyperlink w:anchor="__RefHeading___Toc3812_4014962403" w:tooltip="(Tuỳ chọn) Sự cố 5 – Trang So sánh cần 6 vòng review (PR #8)">
             <w:r>
               <w:rPr>
                 <w:rStyle w:val="IndexLink"/>
@@ -1231,7 +1247,7 @@
             </w:tabs>
             <w:rPr/>
           </w:pPr>
-          <w:hyperlink w:anchor="__RefHeading___Toc3813_3676404199" w:tooltip="5.6. Phần sinh viên tự kiểm chứng">
+          <w:hyperlink w:anchor="__RefHeading___Toc3814_4014962403" w:tooltip="5.6. Phần sinh viên tự kiểm chứng">
             <w:r>
               <w:rPr>
                 <w:rStyle w:val="IndexLink"/>
@@ -1258,7 +1274,7 @@
             </w:tabs>
             <w:rPr/>
           </w:pPr>
-          <w:hyperlink w:anchor="__RefHeading___Toc3815_3676404199" w:tooltip="5.7. Đánh giá việc dùng AI">
+          <w:hyperlink w:anchor="__RefHeading___Toc3816_4014962403" w:tooltip="5.7. Đánh giá việc dùng AI">
             <w:r>
               <w:rPr>
                 <w:rStyle w:val="IndexLink"/>
@@ -1285,7 +1301,7 @@
             </w:tabs>
             <w:rPr/>
           </w:pPr>
-          <w:hyperlink w:anchor="__RefHeading___Toc3817_3676404199" w:tooltip="Chương 6. Thiết kế thực nghiệm">
+          <w:hyperlink w:anchor="__RefHeading___Toc3818_4014962403" w:tooltip="Chương 6. Thiết kế thực nghiệm">
             <w:r>
               <w:rPr>
                 <w:rStyle w:val="IndexLink"/>
@@ -1312,7 +1328,7 @@
             </w:tabs>
             <w:rPr/>
           </w:pPr>
-          <w:hyperlink w:anchor="__RefHeading___Toc3819_3676404199" w:tooltip="6.1. Cách tạo testcase">
+          <w:hyperlink w:anchor="__RefHeading___Toc3820_4014962403" w:tooltip="6.1. Cách tạo testcase">
             <w:r>
               <w:rPr>
                 <w:rStyle w:val="IndexLink"/>
@@ -1339,7 +1355,7 @@
             </w:tabs>
             <w:rPr/>
           </w:pPr>
-          <w:hyperlink w:anchor="__RefHeading___Toc3821_3676404199" w:tooltip="6.2. Phân nhóm">
+          <w:hyperlink w:anchor="__RefHeading___Toc3822_4014962403" w:tooltip="6.2. Phân nhóm">
             <w:r>
               <w:rPr>
                 <w:rStyle w:val="IndexLink"/>
@@ -1366,7 +1382,7 @@
             </w:tabs>
             <w:rPr/>
           </w:pPr>
-          <w:hyperlink w:anchor="__RefHeading___Toc3823_3676404199" w:tooltip="6.3. Đo đạc">
+          <w:hyperlink w:anchor="__RefHeading___Toc3824_4014962403" w:tooltip="6.3. Đo đạc">
             <w:r>
               <w:rPr>
                 <w:rStyle w:val="IndexLink"/>
@@ -1393,7 +1409,7 @@
             </w:tabs>
             <w:rPr/>
           </w:pPr>
-          <w:hyperlink w:anchor="__RefHeading___Toc3825_3676404199" w:tooltip="6.4. Bảo đảm độ phủ">
+          <w:hyperlink w:anchor="__RefHeading___Toc3826_4014962403" w:tooltip="6.4. Bảo đảm độ phủ">
             <w:r>
               <w:rPr>
                 <w:rStyle w:val="IndexLink"/>
@@ -1420,7 +1436,7 @@
             </w:tabs>
             <w:rPr/>
           </w:pPr>
-          <w:hyperlink w:anchor="__RefHeading___Toc3827_3676404199" w:tooltip="Chương 7. Đánh giá">
+          <w:hyperlink w:anchor="__RefHeading___Toc3828_4014962403" w:tooltip="Chương 7. Đánh giá">
             <w:r>
               <w:rPr>
                 <w:rStyle w:val="IndexLink"/>
@@ -1447,7 +1463,7 @@
             </w:tabs>
             <w:rPr/>
           </w:pPr>
-          <w:hyperlink w:anchor="__RefHeading___Toc3829_3676404199" w:tooltip="7.1. Tính đúng">
+          <w:hyperlink w:anchor="__RefHeading___Toc3830_4014962403" w:tooltip="7.1. Tính đúng">
             <w:r>
               <w:rPr>
                 <w:rStyle w:val="IndexLink"/>
@@ -1474,7 +1490,7 @@
             </w:tabs>
             <w:rPr/>
           </w:pPr>
-          <w:hyperlink w:anchor="__RefHeading___Toc3831_3676404199" w:tooltip="7.2. Kết quả so sánh">
+          <w:hyperlink w:anchor="__RefHeading___Toc3832_4014962403" w:tooltip="7.2. Kết quả so sánh">
             <w:r>
               <w:rPr>
                 <w:rStyle w:val="IndexLink"/>
@@ -1501,7 +1517,7 @@
             </w:tabs>
             <w:rPr/>
           </w:pPr>
-          <w:hyperlink w:anchor="__RefHeading___Toc3833_3676404199" w:tooltip="7.3. Tính trực quan và khả năng minh họa">
+          <w:hyperlink w:anchor="__RefHeading___Toc3834_4014962403" w:tooltip="7.3. Tính trực quan và khả năng minh họa">
             <w:r>
               <w:rPr>
                 <w:rStyle w:val="IndexLink"/>
@@ -1528,7 +1544,7 @@
             </w:tabs>
             <w:rPr/>
           </w:pPr>
-          <w:hyperlink w:anchor="__RefHeading___Toc3835_3676404199" w:tooltip="7.4. Hạn chế">
+          <w:hyperlink w:anchor="__RefHeading___Toc3836_4014962403" w:tooltip="7.4. Hạn chế">
             <w:r>
               <w:rPr>
                 <w:rStyle w:val="IndexLink"/>
@@ -1555,7 +1571,7 @@
             </w:tabs>
             <w:rPr/>
           </w:pPr>
-          <w:hyperlink w:anchor="__RefHeading___Toc3837_3676404199" w:tooltip="7.5. Hướng phát triển">
+          <w:hyperlink w:anchor="__RefHeading___Toc3838_4014962403" w:tooltip="7.5. Hướng phát triển">
             <w:r>
               <w:rPr>
                 <w:rStyle w:val="IndexLink"/>
@@ -1582,7 +1598,7 @@
             </w:tabs>
             <w:rPr/>
           </w:pPr>
-          <w:hyperlink w:anchor="__RefHeading___Toc3839_3676404199" w:tooltip="Chương 8. Phát triển mở rộng">
+          <w:hyperlink w:anchor="__RefHeading___Toc3840_4014962403" w:tooltip="Chương 8. Phát triển mở rộng">
             <w:r>
               <w:rPr>
                 <w:rStyle w:val="IndexLink"/>
@@ -1609,7 +1625,7 @@
             </w:tabs>
             <w:rPr/>
           </w:pPr>
-          <w:hyperlink w:anchor="__RefHeading___Toc3841_3676404199" w:tooltip="Tài liệu tham khảo">
+          <w:hyperlink w:anchor="__RefHeading___Toc3842_4014962403" w:tooltip="Tài liệu tham khảo">
             <w:r>
               <w:rPr>
                 <w:rStyle w:val="IndexLink"/>
@@ -1636,7 +1652,7 @@
             </w:tabs>
             <w:rPr/>
           </w:pPr>
-          <w:hyperlink w:anchor="__RefHeading___Toc3843_3676404199" w:tooltip="Phụ lục">
+          <w:hyperlink w:anchor="__RefHeading___Toc3844_4014962403" w:tooltip="Phụ lục">
             <w:r>
               <w:rPr>
                 <w:rStyle w:val="IndexLink"/>
@@ -1680,7 +1696,7 @@
         <w:spacing w:before="0" w:after="200"/>
         <w:rPr/>
       </w:pPr>
-      <w:bookmarkStart w:id="0" w:name="__RefHeading___Toc3739_3676404199"/>
+      <w:bookmarkStart w:id="0" w:name="__RefHeading___Toc3740_4014962403"/>
       <w:bookmarkEnd w:id="0"/>
       <w:r>
         <w:rPr>
@@ -1696,7 +1712,7 @@
         <w:pStyle w:val="Heading2"/>
         <w:rPr/>
       </w:pPr>
-      <w:bookmarkStart w:id="1" w:name="__RefHeading___Toc3741_3676404199"/>
+      <w:bookmarkStart w:id="1" w:name="__RefHeading___Toc3742_4014962403"/>
       <w:bookmarkEnd w:id="1"/>
       <w:r>
         <w:rPr>
@@ -1818,7 +1834,7 @@
         <w:pStyle w:val="Heading2"/>
         <w:rPr/>
       </w:pPr>
-      <w:bookmarkStart w:id="2" w:name="__RefHeading___Toc3743_3676404199"/>
+      <w:bookmarkStart w:id="2" w:name="__RefHeading___Toc3744_4014962403"/>
       <w:bookmarkEnd w:id="2"/>
       <w:r>
         <w:rPr>
@@ -2007,7 +2023,7 @@
         <w:pStyle w:val="Heading2"/>
         <w:rPr/>
       </w:pPr>
-      <w:bookmarkStart w:id="3" w:name="__RefHeading___Toc3745_3676404199"/>
+      <w:bookmarkStart w:id="3" w:name="__RefHeading___Toc3746_4014962403"/>
       <w:bookmarkEnd w:id="3"/>
       <w:r>
         <w:rPr>
@@ -2156,7 +2172,7 @@
         <w:pStyle w:val="Heading1"/>
         <w:rPr/>
       </w:pPr>
-      <w:bookmarkStart w:id="4" w:name="__RefHeading___Toc3747_3676404199"/>
+      <w:bookmarkStart w:id="4" w:name="__RefHeading___Toc3748_4014962403"/>
       <w:bookmarkEnd w:id="4"/>
       <w:r>
         <w:rPr>
@@ -2172,7 +2188,7 @@
         <w:pStyle w:val="Heading2"/>
         <w:rPr/>
       </w:pPr>
-      <w:bookmarkStart w:id="5" w:name="__RefHeading___Toc3749_3676404199"/>
+      <w:bookmarkStart w:id="5" w:name="__RefHeading___Toc3750_4014962403"/>
       <w:bookmarkEnd w:id="5"/>
       <w:r>
         <w:rPr>
@@ -2221,7 +2237,7 @@
         <w:pStyle w:val="Heading2"/>
         <w:rPr/>
       </w:pPr>
-      <w:bookmarkStart w:id="6" w:name="__RefHeading___Toc3751_3676404199"/>
+      <w:bookmarkStart w:id="6" w:name="__RefHeading___Toc3752_4014962403"/>
       <w:bookmarkEnd w:id="6"/>
       <w:r>
         <w:rPr>
@@ -2792,7 +2808,7 @@
         <w:pStyle w:val="Heading2"/>
         <w:rPr/>
       </w:pPr>
-      <w:bookmarkStart w:id="7" w:name="__RefHeading___Toc3753_3676404199"/>
+      <w:bookmarkStart w:id="7" w:name="__RefHeading___Toc3754_4014962403"/>
       <w:bookmarkEnd w:id="7"/>
       <w:r>
         <w:rPr>
@@ -3140,7 +3156,7 @@
         <w:pStyle w:val="Heading2"/>
         <w:rPr/>
       </w:pPr>
-      <w:bookmarkStart w:id="8" w:name="__RefHeading___Toc3755_3676404199"/>
+      <w:bookmarkStart w:id="8" w:name="__RefHeading___Toc3756_4014962403"/>
       <w:bookmarkEnd w:id="8"/>
       <w:r>
         <w:rPr>
@@ -3401,7 +3417,7 @@
         <w:pStyle w:val="Heading2"/>
         <w:rPr/>
       </w:pPr>
-      <w:bookmarkStart w:id="9" w:name="__RefHeading___Toc3757_3676404199"/>
+      <w:bookmarkStart w:id="9" w:name="__RefHeading___Toc3758_4014962403"/>
       <w:bookmarkEnd w:id="9"/>
       <w:r>
         <w:rPr>
@@ -3973,7 +3989,7 @@
         <w:pStyle w:val="Heading2"/>
         <w:rPr/>
       </w:pPr>
-      <w:bookmarkStart w:id="10" w:name="__RefHeading___Toc3759_3676404199"/>
+      <w:bookmarkStart w:id="10" w:name="__RefHeading___Toc3760_4014962403"/>
       <w:bookmarkEnd w:id="10"/>
       <w:r>
         <w:rPr>
@@ -4816,7 +4832,7 @@
         <w:pStyle w:val="Heading1"/>
         <w:rPr/>
       </w:pPr>
-      <w:bookmarkStart w:id="11" w:name="__RefHeading___Toc3761_3676404199"/>
+      <w:bookmarkStart w:id="11" w:name="__RefHeading___Toc3762_4014962403"/>
       <w:bookmarkEnd w:id="11"/>
       <w:r>
         <w:rPr>
@@ -4832,7 +4848,7 @@
         <w:pStyle w:val="Heading2"/>
         <w:rPr/>
       </w:pPr>
-      <w:bookmarkStart w:id="12" w:name="__RefHeading___Toc3763_3676404199"/>
+      <w:bookmarkStart w:id="12" w:name="__RefHeading___Toc3764_4014962403"/>
       <w:bookmarkEnd w:id="12"/>
       <w:r>
         <w:rPr>
@@ -5182,7 +5198,7 @@
         <w:pStyle w:val="Heading2"/>
         <w:rPr/>
       </w:pPr>
-      <w:bookmarkStart w:id="13" w:name="__RefHeading___Toc3765_3676404199"/>
+      <w:bookmarkStart w:id="13" w:name="__RefHeading___Toc3766_4014962403"/>
       <w:bookmarkEnd w:id="13"/>
       <w:r>
         <w:rPr>
@@ -5393,7 +5409,7 @@
         <w:pStyle w:val="Heading2"/>
         <w:rPr/>
       </w:pPr>
-      <w:bookmarkStart w:id="14" w:name="__RefHeading___Toc3767_3676404199"/>
+      <w:bookmarkStart w:id="14" w:name="__RefHeading___Toc3768_4014962403"/>
       <w:bookmarkEnd w:id="14"/>
       <w:r>
         <w:rPr>
@@ -5429,7 +5445,7 @@
         <w:pStyle w:val="Heading3"/>
         <w:rPr/>
       </w:pPr>
-      <w:bookmarkStart w:id="15" w:name="__RefHeading___Toc3769_3676404199"/>
+      <w:bookmarkStart w:id="15" w:name="__RefHeading___Toc3770_4014962403"/>
       <w:bookmarkEnd w:id="15"/>
       <w:r>
         <w:rPr>
@@ -5699,7 +5715,7 @@
         <w:pStyle w:val="Heading3"/>
         <w:rPr/>
       </w:pPr>
-      <w:bookmarkStart w:id="16" w:name="__RefHeading___Toc3771_3676404199"/>
+      <w:bookmarkStart w:id="16" w:name="__RefHeading___Toc3772_4014962403"/>
       <w:bookmarkEnd w:id="16"/>
       <w:r>
         <w:rPr>
@@ -5900,7 +5916,7 @@
         <w:pStyle w:val="Heading3"/>
         <w:rPr/>
       </w:pPr>
-      <w:bookmarkStart w:id="17" w:name="__RefHeading___Toc3773_3676404199"/>
+      <w:bookmarkStart w:id="17" w:name="__RefHeading___Toc3774_4014962403"/>
       <w:bookmarkEnd w:id="17"/>
       <w:r>
         <w:rPr>
@@ -6200,7 +6216,7 @@
         <w:pStyle w:val="Heading3"/>
         <w:rPr/>
       </w:pPr>
-      <w:bookmarkStart w:id="18" w:name="__RefHeading___Toc3775_3676404199"/>
+      <w:bookmarkStart w:id="18" w:name="__RefHeading___Toc3776_4014962403"/>
       <w:bookmarkEnd w:id="18"/>
       <w:r>
         <w:rPr>
@@ -6622,7 +6638,7 @@
         <w:pStyle w:val="Heading3"/>
         <w:rPr/>
       </w:pPr>
-      <w:bookmarkStart w:id="19" w:name="__RefHeading___Toc3777_3676404199"/>
+      <w:bookmarkStart w:id="19" w:name="__RefHeading___Toc3778_4014962403"/>
       <w:bookmarkEnd w:id="19"/>
       <w:r>
         <w:rPr>
@@ -6941,7 +6957,7 @@
         <w:pStyle w:val="Heading3"/>
         <w:rPr/>
       </w:pPr>
-      <w:bookmarkStart w:id="20" w:name="__RefHeading___Toc3779_3676404199"/>
+      <w:bookmarkStart w:id="20" w:name="__RefHeading___Toc3780_4014962403"/>
       <w:bookmarkEnd w:id="20"/>
       <w:r>
         <w:rPr>
@@ -7781,7 +7797,7 @@
         <w:pStyle w:val="Heading3"/>
         <w:rPr/>
       </w:pPr>
-      <w:bookmarkStart w:id="21" w:name="__RefHeading___Toc3781_3676404199"/>
+      <w:bookmarkStart w:id="21" w:name="__RefHeading___Toc3782_4014962403"/>
       <w:bookmarkEnd w:id="21"/>
       <w:r>
         <w:rPr>
@@ -8102,7 +8118,7 @@
         <w:pStyle w:val="Heading1"/>
         <w:rPr/>
       </w:pPr>
-      <w:bookmarkStart w:id="22" w:name="__RefHeading___Toc3783_3676404199"/>
+      <w:bookmarkStart w:id="22" w:name="__RefHeading___Toc3784_4014962403"/>
       <w:bookmarkEnd w:id="22"/>
       <w:r>
         <w:rPr>
@@ -8118,7 +8134,7 @@
         <w:pStyle w:val="Heading2"/>
         <w:rPr/>
       </w:pPr>
-      <w:bookmarkStart w:id="23" w:name="__RefHeading___Toc3785_3676404199"/>
+      <w:bookmarkStart w:id="23" w:name="__RefHeading___Toc3786_4014962403"/>
       <w:bookmarkEnd w:id="23"/>
       <w:r>
         <w:rPr>
@@ -8361,7 +8377,7 @@
         <w:pStyle w:val="Heading2"/>
         <w:rPr/>
       </w:pPr>
-      <w:bookmarkStart w:id="24" w:name="__RefHeading___Toc3787_3676404199"/>
+      <w:bookmarkStart w:id="24" w:name="__RefHeading___Toc3788_4014962403"/>
       <w:bookmarkEnd w:id="24"/>
       <w:r>
         <w:rPr>
@@ -12287,7 +12303,7 @@
         <w:pStyle w:val="Heading2"/>
         <w:rPr/>
       </w:pPr>
-      <w:bookmarkStart w:id="25" w:name="__RefHeading___Toc3789_3676404199"/>
+      <w:bookmarkStart w:id="25" w:name="__RefHeading___Toc3790_4014962403"/>
       <w:bookmarkEnd w:id="25"/>
       <w:r>
         <w:rPr>
@@ -15169,7 +15185,7 @@
         <w:pStyle w:val="Heading1"/>
         <w:rPr/>
       </w:pPr>
-      <w:bookmarkStart w:id="26" w:name="__RefHeading___Toc3791_3676404199"/>
+      <w:bookmarkStart w:id="26" w:name="__RefHeading___Toc3792_4014962403"/>
       <w:bookmarkEnd w:id="26"/>
       <w:r>
         <w:rPr>
@@ -15185,7 +15201,7 @@
         <w:pStyle w:val="Heading2"/>
         <w:rPr/>
       </w:pPr>
-      <w:bookmarkStart w:id="27" w:name="__RefHeading___Toc3793_3676404199"/>
+      <w:bookmarkStart w:id="27" w:name="__RefHeading___Toc3794_4014962403"/>
       <w:bookmarkEnd w:id="27"/>
       <w:r>
         <w:rPr>
@@ -15448,7 +15464,7 @@
         <w:pStyle w:val="Heading2"/>
         <w:rPr/>
       </w:pPr>
-      <w:bookmarkStart w:id="28" w:name="__RefHeading___Toc3795_3676404199"/>
+      <w:bookmarkStart w:id="28" w:name="__RefHeading___Toc3796_4014962403"/>
       <w:bookmarkEnd w:id="28"/>
       <w:r>
         <w:rPr>
@@ -16013,7 +16029,7 @@
         <w:pStyle w:val="Heading2"/>
         <w:rPr/>
       </w:pPr>
-      <w:bookmarkStart w:id="29" w:name="__RefHeading___Toc3797_3676404199"/>
+      <w:bookmarkStart w:id="29" w:name="__RefHeading___Toc3798_4014962403"/>
       <w:bookmarkEnd w:id="29"/>
       <w:r>
         <w:rPr>
@@ -17322,7 +17338,7 @@
         <w:pStyle w:val="Heading2"/>
         <w:rPr/>
       </w:pPr>
-      <w:bookmarkStart w:id="30" w:name="__RefHeading___Toc3799_3676404199"/>
+      <w:bookmarkStart w:id="30" w:name="__RefHeading___Toc3800_4014962403"/>
       <w:bookmarkEnd w:id="30"/>
       <w:r>
         <w:rPr>
@@ -17665,7 +17681,7 @@
         <w:pStyle w:val="Heading2"/>
         <w:rPr/>
       </w:pPr>
-      <w:bookmarkStart w:id="31" w:name="__RefHeading___Toc3801_3676404199"/>
+      <w:bookmarkStart w:id="31" w:name="__RefHeading___Toc3802_4014962403"/>
       <w:bookmarkEnd w:id="31"/>
       <w:r>
         <w:rPr>
@@ -17718,7 +17734,7 @@
         <w:pStyle w:val="Heading3"/>
         <w:rPr/>
       </w:pPr>
-      <w:bookmarkStart w:id="32" w:name="__RefHeading___Toc3803_3676404199"/>
+      <w:bookmarkStart w:id="32" w:name="__RefHeading___Toc3804_4014962403"/>
       <w:bookmarkEnd w:id="32"/>
       <w:r>
         <w:rPr>
@@ -18216,7 +18232,7 @@
         <w:pStyle w:val="Heading3"/>
         <w:rPr/>
       </w:pPr>
-      <w:bookmarkStart w:id="33" w:name="__RefHeading___Toc3805_3676404199"/>
+      <w:bookmarkStart w:id="33" w:name="__RefHeading___Toc3806_4014962403"/>
       <w:bookmarkEnd w:id="33"/>
       <w:r>
         <w:rPr>
@@ -18418,7 +18434,7 @@
         <w:pStyle w:val="Heading3"/>
         <w:rPr/>
       </w:pPr>
-      <w:bookmarkStart w:id="34" w:name="__RefHeading___Toc3807_3676404199"/>
+      <w:bookmarkStart w:id="34" w:name="__RefHeading___Toc3808_4014962403"/>
       <w:bookmarkEnd w:id="34"/>
       <w:r>
         <w:rPr>
@@ -18620,7 +18636,7 @@
         <w:pStyle w:val="Heading3"/>
         <w:rPr/>
       </w:pPr>
-      <w:bookmarkStart w:id="35" w:name="__RefHeading___Toc3809_3676404199"/>
+      <w:bookmarkStart w:id="35" w:name="__RefHeading___Toc3810_4014962403"/>
       <w:bookmarkEnd w:id="35"/>
       <w:r>
         <w:rPr>
@@ -18756,7 +18772,7 @@
         <w:pStyle w:val="Heading3"/>
         <w:rPr/>
       </w:pPr>
-      <w:bookmarkStart w:id="36" w:name="__RefHeading___Toc3811_3676404199"/>
+      <w:bookmarkStart w:id="36" w:name="__RefHeading___Toc3812_4014962403"/>
       <w:bookmarkEnd w:id="36"/>
       <w:r>
         <w:rPr>
@@ -18785,7 +18801,7 @@
         <w:pStyle w:val="Heading2"/>
         <w:rPr/>
       </w:pPr>
-      <w:bookmarkStart w:id="37" w:name="__RefHeading___Toc3813_3676404199"/>
+      <w:bookmarkStart w:id="37" w:name="__RefHeading___Toc3814_4014962403"/>
       <w:bookmarkEnd w:id="37"/>
       <w:r>
         <w:rPr>
@@ -18898,7 +18914,7 @@
         <w:pStyle w:val="Heading2"/>
         <w:rPr/>
       </w:pPr>
-      <w:bookmarkStart w:id="38" w:name="__RefHeading___Toc3815_3676404199"/>
+      <w:bookmarkStart w:id="38" w:name="__RefHeading___Toc3816_4014962403"/>
       <w:bookmarkEnd w:id="38"/>
       <w:r>
         <w:rPr>
@@ -19166,7 +19182,7 @@
         <w:pStyle w:val="Heading1"/>
         <w:rPr/>
       </w:pPr>
-      <w:bookmarkStart w:id="39" w:name="__RefHeading___Toc3817_3676404199"/>
+      <w:bookmarkStart w:id="39" w:name="__RefHeading___Toc3818_4014962403"/>
       <w:bookmarkEnd w:id="39"/>
       <w:r>
         <w:rPr>
@@ -19182,7 +19198,7 @@
         <w:pStyle w:val="Heading2"/>
         <w:rPr/>
       </w:pPr>
-      <w:bookmarkStart w:id="40" w:name="__RefHeading___Toc3819_3676404199"/>
+      <w:bookmarkStart w:id="40" w:name="__RefHeading___Toc3820_4014962403"/>
       <w:bookmarkEnd w:id="40"/>
       <w:r>
         <w:rPr>
@@ -19318,7 +19334,7 @@
         <w:pStyle w:val="Heading2"/>
         <w:rPr/>
       </w:pPr>
-      <w:bookmarkStart w:id="41" w:name="__RefHeading___Toc3821_3676404199"/>
+      <w:bookmarkStart w:id="41" w:name="__RefHeading___Toc3822_4014962403"/>
       <w:bookmarkEnd w:id="41"/>
       <w:r>
         <w:rPr>
@@ -22147,7 +22163,7 @@
         <w:pStyle w:val="Heading2"/>
         <w:rPr/>
       </w:pPr>
-      <w:bookmarkStart w:id="42" w:name="__RefHeading___Toc3823_3676404199"/>
+      <w:bookmarkStart w:id="42" w:name="__RefHeading___Toc3824_4014962403"/>
       <w:bookmarkEnd w:id="42"/>
       <w:r>
         <w:rPr>
@@ -22298,7 +22314,7 @@
         <w:pStyle w:val="Heading2"/>
         <w:rPr/>
       </w:pPr>
-      <w:bookmarkStart w:id="43" w:name="__RefHeading___Toc3825_3676404199"/>
+      <w:bookmarkStart w:id="43" w:name="__RefHeading___Toc3826_4014962403"/>
       <w:bookmarkEnd w:id="43"/>
       <w:r>
         <w:rPr>
@@ -23034,7 +23050,7 @@
         <w:pStyle w:val="Heading1"/>
         <w:rPr/>
       </w:pPr>
-      <w:bookmarkStart w:id="44" w:name="__RefHeading___Toc3827_3676404199"/>
+      <w:bookmarkStart w:id="44" w:name="__RefHeading___Toc3828_4014962403"/>
       <w:bookmarkEnd w:id="44"/>
       <w:r>
         <w:rPr>
@@ -23050,7 +23066,7 @@
         <w:pStyle w:val="Heading2"/>
         <w:rPr/>
       </w:pPr>
-      <w:bookmarkStart w:id="45" w:name="__RefHeading___Toc3829_3676404199"/>
+      <w:bookmarkStart w:id="45" w:name="__RefHeading___Toc3830_4014962403"/>
       <w:bookmarkEnd w:id="45"/>
       <w:r>
         <w:rPr>
@@ -23278,7 +23294,7 @@
         <w:pStyle w:val="Heading2"/>
         <w:rPr/>
       </w:pPr>
-      <w:bookmarkStart w:id="46" w:name="__RefHeading___Toc3831_3676404199"/>
+      <w:bookmarkStart w:id="46" w:name="__RefHeading___Toc3832_4014962403"/>
       <w:bookmarkEnd w:id="46"/>
       <w:r>
         <w:rPr>
@@ -24164,7 +24180,7 @@
         <w:pStyle w:val="Heading2"/>
         <w:rPr/>
       </w:pPr>
-      <w:bookmarkStart w:id="47" w:name="__RefHeading___Toc3833_3676404199"/>
+      <w:bookmarkStart w:id="47" w:name="__RefHeading___Toc3834_4014962403"/>
       <w:bookmarkEnd w:id="47"/>
       <w:r>
         <w:rPr>
@@ -24237,7 +24253,7 @@
         <w:pStyle w:val="Heading2"/>
         <w:rPr/>
       </w:pPr>
-      <w:bookmarkStart w:id="48" w:name="__RefHeading___Toc3835_3676404199"/>
+      <w:bookmarkStart w:id="48" w:name="__RefHeading___Toc3836_4014962403"/>
       <w:bookmarkEnd w:id="48"/>
       <w:r>
         <w:rPr>
@@ -24402,7 +24418,7 @@
         <w:pStyle w:val="Heading2"/>
         <w:rPr/>
       </w:pPr>
-      <w:bookmarkStart w:id="49" w:name="__RefHeading___Toc3837_3676404199"/>
+      <w:bookmarkStart w:id="49" w:name="__RefHeading___Toc3838_4014962403"/>
       <w:bookmarkEnd w:id="49"/>
       <w:r>
         <w:rPr>
@@ -24478,7 +24494,7 @@
         <w:pStyle w:val="Heading1"/>
         <w:rPr/>
       </w:pPr>
-      <w:bookmarkStart w:id="50" w:name="__RefHeading___Toc3839_3676404199"/>
+      <w:bookmarkStart w:id="50" w:name="__RefHeading___Toc3840_4014962403"/>
       <w:bookmarkEnd w:id="50"/>
       <w:r>
         <w:rPr>
@@ -25095,7 +25111,7 @@
         <w:pStyle w:val="Heading1"/>
         <w:rPr/>
       </w:pPr>
-      <w:bookmarkStart w:id="51" w:name="__RefHeading___Toc3841_3676404199"/>
+      <w:bookmarkStart w:id="51" w:name="__RefHeading___Toc3842_4014962403"/>
       <w:bookmarkEnd w:id="51"/>
       <w:r>
         <w:rPr>
@@ -25231,7 +25247,7 @@
         <w:pStyle w:val="Heading1"/>
         <w:rPr/>
       </w:pPr>
-      <w:bookmarkStart w:id="52" w:name="__RefHeading___Toc3843_3676404199"/>
+      <w:bookmarkStart w:id="52" w:name="__RefHeading___Toc3844_4014962403"/>
       <w:bookmarkEnd w:id="52"/>
       <w:r>
         <w:rPr>

</xml_diff>